<commit_message>
Update single-task results, docs, and BCS ablation studies
</commit_message>
<xml_diff>
--- a/docs/presentation_key_concepts.docx
+++ b/docs/presentation_key_concepts.docx
@@ -839,17 +839,17 @@
     </w:p>
     <w:p>
       <w:r>
-        <w:t>Here is the baseline performance table showing the results of each base model:</w:t>
+        <w:t>Here is the baseline performance table showing the complete results of each base model across all 4 tasks:</w:t>
       </w:r>
     </w:p>
     <w:p>
       <w:r>
-        <w:t>| Model Architecture | BCS Test MAE (Dryad / SciDB) | Behavior Test Macro F1 | Lameness Test AUC | ID Top-1 Accuracy | Average Rank |</w:t>
+        <w:t>| Person | Model | BCS MAE ↓ | BCS Exact Acc ↑ | BCS ±1 Acc ↑ | Behavior F1 ↑ | Lameness Acc ↑ | Lameness AUC ↑ | Cow ID Acc ↑ |</w:t>
       </w:r>
     </w:p>
     <w:p>
       <w:r>
-        <w:t>| :--- | :--- | :--- | :--- | :--- | :--- |</w:t>
+        <w:t>|--------|-------|-----------|----------------|-------------|--------------|---------------|----------------|-------------|</w:t>
       </w:r>
     </w:p>
     <w:p>
@@ -860,10 +860,73 @@
         <w:rPr>
           <w:b/>
         </w:rPr>
-        <w:t>ResNet-18</w:t>
-      </w:r>
-      <w:r>
-        <w:t xml:space="preserve"> (Hasin) | 0.8675 / 0.5800 | 0.7134 | 0.9600 (ST) | -- | 4th |</w:t>
+        <w:t>Nusrat</w:t>
+      </w:r>
+      <w:r>
+        <w:t xml:space="preserve"> ✓ | EfficientNetB0 | </w:t>
+      </w:r>
+      <w:r>
+        <w:rPr>
+          <w:b/>
+        </w:rPr>
+        <w:t>0.557</w:t>
+      </w:r>
+      <w:r>
+        <w:t xml:space="preserve"> | </w:t>
+      </w:r>
+      <w:r>
+        <w:rPr>
+          <w:b/>
+        </w:rPr>
+        <w:t>55.06%</w:t>
+      </w:r>
+      <w:r>
+        <w:t xml:space="preserve"> | </w:t>
+      </w:r>
+      <w:r>
+        <w:rPr>
+          <w:b/>
+        </w:rPr>
+        <w:t>90.50%</w:t>
+      </w:r>
+      <w:r>
+        <w:t xml:space="preserve"> | </w:t>
+      </w:r>
+      <w:r>
+        <w:rPr>
+          <w:b/>
+        </w:rPr>
+        <w:t>0.745</w:t>
+      </w:r>
+      <w:r>
+        <w:t xml:space="preserve"> | </w:t>
+      </w:r>
+      <w:r>
+        <w:rPr>
+          <w:b/>
+        </w:rPr>
+        <w:t>93.05%</w:t>
+      </w:r>
+      <w:r>
+        <w:t xml:space="preserve"> | </w:t>
+      </w:r>
+      <w:r>
+        <w:rPr>
+          <w:b/>
+        </w:rPr>
+        <w:t>0.983</w:t>
+      </w:r>
+      <w:r>
+        <w:t xml:space="preserve"> | </w:t>
+      </w:r>
+      <w:r>
+        <w:rPr>
+          <w:b/>
+        </w:rPr>
+        <w:t>86.49%</w:t>
+      </w:r>
+      <w:r>
+        <w:t xml:space="preserve"> |</w:t>
       </w:r>
     </w:p>
     <w:p>
@@ -874,10 +937,10 @@
         <w:rPr>
           <w:b/>
         </w:rPr>
-        <w:t>MobileNetV3-Small</w:t>
-      </w:r>
-      <w:r>
-        <w:t xml:space="preserve"> (Namira) | 0.5250 / 0.7090 | 0.6810 | -- | -- | 5th |</w:t>
+        <w:t>Hasin</w:t>
+      </w:r>
+      <w:r>
+        <w:t xml:space="preserve"> | ResNet-18 | 0.580 | 54.81% | 89.02% | 0.713 | 75.30% | 0.720 | 45.56% |</w:t>
       </w:r>
     </w:p>
     <w:p>
@@ -888,10 +951,10 @@
         <w:rPr>
           <w:b/>
         </w:rPr>
-        <w:t>ResNet-50</w:t>
-      </w:r>
-      <w:r>
-        <w:t xml:space="preserve"> (Bithi) | 0.6300 / 0.6485 | 0.7037 | -- | -- | 3rd |</w:t>
+        <w:t>Shouvik</w:t>
+      </w:r>
+      <w:r>
+        <w:t xml:space="preserve"> | DenseNet121 | 0.629 | 49.51% | 88.78% | 0.737 | 73.98% | 0.794 | 82.46% |</w:t>
       </w:r>
     </w:p>
     <w:p>
@@ -902,10 +965,10 @@
         <w:rPr>
           <w:b/>
         </w:rPr>
-        <w:t>DenseNet121</w:t>
-      </w:r>
-      <w:r>
-        <w:t xml:space="preserve"> (Shouvik) | 0.5875 / 0.6292 | 0.7366 | -- | -- | 2nd |</w:t>
+        <w:t>Bithi</w:t>
+      </w:r>
+      <w:r>
+        <w:t xml:space="preserve"> | ResNet-50 | 0.649 | 48.43% | 88.20% | 0.704 | 80.97% | 0.744 | 53.02% |</w:t>
       </w:r>
     </w:p>
     <w:p>
@@ -916,19 +979,10 @@
         <w:rPr>
           <w:b/>
         </w:rPr>
-        <w:t>EfficientNetB0</w:t>
-      </w:r>
-      <w:r>
-        <w:t xml:space="preserve"> (Nusrat) | 0.6175 / 0.5566 | 0.7445 | 0.9829 (Spatial) | 86.49% | </w:t>
-      </w:r>
-      <w:r>
-        <w:rPr>
-          <w:b/>
-        </w:rPr>
-        <w:t>1st (Selected)</w:t>
-      </w:r>
-      <w:r>
-        <w:t xml:space="preserve"> |</w:t>
+        <w:t>Namira</w:t>
+      </w:r>
+      <w:r>
+        <w:t xml:space="preserve"> | MobileNetV3-S | 0.709 | 44.67% | 86.47% | 0.681 | 75.66% | 0.723 | 78.83% |</w:t>
       </w:r>
     </w:p>
     <w:p>
@@ -937,33 +991,13 @@
         <w:rPr>
           <w:i/>
         </w:rPr>
-        <w:t>\</w:t>
-      </w:r>
-      <w:r>
-        <w:t xml:space="preserve">Note: The 0.9600 Spatiotemporal (ST) </w:t>
-      </w:r>
-      <w:r>
-        <w:rPr>
-          <w:i/>
-        </w:rPr>
-        <w:t>(image sequence tracking)</w:t>
-      </w:r>
-      <w:r>
-        <w:t xml:space="preserve"> AUC </w:t>
-      </w:r>
-      <w:r>
-        <w:rPr>
-          <w:i/>
-        </w:rPr>
-        <w:t>(Area Under the ROC Curve)</w:t>
-      </w:r>
-      <w:r>
-        <w:t xml:space="preserve"> was achieved using the ResNet18-LSTM sequence model. The selected EfficientNet-B0 backbone achieved 0.9829 (Spatial AUC) as a single-task baseline, and 0.8400 (Sequence AUC) when integrated with the LSTM sequence tracking model.*</w:t>
-      </w:r>
+        <w:t>BCS metrics are on ScienceDB (the primary dataset). ✓ = selected backbone.</w:t>
+      </w:r>
+      <w:r/>
     </w:p>
     <w:p>
       <w:r>
-        <w:t xml:space="preserve">The backbone with the best average rank is </w:t>
+        <w:t xml:space="preserve">The backbone with the best overall rank is </w:t>
       </w:r>
       <w:r>
         <w:rPr>
@@ -972,16 +1006,7 @@
         <w:t>EfficientNetB0</w:t>
       </w:r>
       <w:r>
-        <w:t xml:space="preserve"> (Nusrat), which achieves a Test MAE </w:t>
-      </w:r>
-      <w:r>
-        <w:rPr>
-          <w:i/>
-        </w:rPr>
-        <w:t>(Mean Absolute Error)</w:t>
-      </w:r>
-      <w:r>
-        <w:t xml:space="preserve"> of `0.6175` (Dryad) and `0.5566` (ScienceDB), a Behavior Test F1 of `0.7445`, and a Lameness Test AUC of `0.9829` (Spatial). It serves as the shared backbone for the final Multi-Task model.</w:t>
+        <w:t xml:space="preserve"> (Nusrat). It achieves the best BCS MAE (`0.557`), the highest Behavior F1 (`0.745`), the best Lameness Accuracy (`93.05%`) and AUC (`0.983`) by a large margin, and the highest ID Top-1 Accuracy (`86.49%`). It serves as the shared backbone for the final Multi-Task model.</w:t>
       </w:r>
     </w:p>
     <w:p>
@@ -3696,7 +3721,7 @@
           <w:color w:val="555555"/>
           <w:sz w:val="23"/>
         </w:rPr>
-        <w:t>How Much Training is Done?</w:t>
+        <w:t>How Much Training is Done? (Status as of June 9, 2026)</w:t>
       </w:r>
     </w:p>
     <w:p>
@@ -3710,7 +3735,7 @@
         <w:t>(training individual components of a complex model in separate, ordered stages)</w:t>
       </w:r>
       <w:r>
-        <w:t xml:space="preserve"> is currently in execution:</w:t>
+        <w:t xml:space="preserve"> current status:</w:t>
       </w:r>
     </w:p>
     <w:p>
@@ -3726,7 +3751,7 @@
         <w:t>BCS Baseline:</w:t>
       </w:r>
       <w:r>
-        <w:t xml:space="preserve"> [100% COMPLETE] All 5 base models trained. Results logged.</w:t>
+        <w:t xml:space="preserve"> ✅ COMPLETE — All 5 base models trained on Dryad + ScienceDB datasets.</w:t>
       </w:r>
     </w:p>
     <w:p>
@@ -3742,7 +3767,7 @@
         <w:t>Behavior Baseline:</w:t>
       </w:r>
       <w:r>
-        <w:t xml:space="preserve"> [100% COMPLETE] All 5 base models trained using Focal Loss. Results logged.</w:t>
+        <w:t xml:space="preserve"> ✅ COMPLETE — All 5 base models trained. Cross-dataset eval on CBVD-5 also done (Macro F1: 0.1245 — domain shift confirmed).</w:t>
       </w:r>
     </w:p>
     <w:p>
@@ -3755,14 +3780,23 @@
         <w:rPr>
           <w:b/>
         </w:rPr>
-        <w:t>Lameness Baseline (Spatial vs Spatiotemporal):</w:t>
-      </w:r>
-      <w:r>
-        <w:t xml:space="preserve"> [COMPLETE] Preliminary 2D models trained. The Spatiotemporal LSTM model was trained for 15 epochs on a 20-frame sampled sequence, achieving a 1.0 Validation AUC and 0.96 Test AUC.</w:t>
+        <w:t>Lameness Baseline (ALL 5 members):</w:t>
+      </w:r>
+      <w:r>
+        <w:t xml:space="preserve"> ✅ COMPLETE — All 5 trained on YOLO-cropped CattleLameness dataset.</w:t>
       </w:r>
     </w:p>
     <w:p>
       <w:pPr>
+        <w:pStyle w:val="ListBullet"/>
+        <w:spacing w:after="60"/>
+      </w:pPr>
+      <w:r>
+        <w:t>Best: EfficientNetB0 (93.05% Acc, 0.9829 AUC) | Worst: DenseNet121 (73.98% Acc, 0.7944 AUC)</w:t>
+      </w:r>
+    </w:p>
+    <w:p>
+      <w:pPr>
         <w:pStyle w:val="ListNumber"/>
         <w:spacing w:after="60"/>
       </w:pPr>
@@ -3771,14 +3805,23 @@
         <w:rPr>
           <w:b/>
         </w:rPr>
-        <w:t>ID Baseline:</w:t>
-      </w:r>
-      <w:r>
-        <w:t xml:space="preserve"> [100% COMPLETE] EfficientNetB0 baseline trained for 10 epochs, achieving 86.49% Test Top-1 Accuracy.</w:t>
+        <w:t>ID Baseline (ALL 5 members):</w:t>
+      </w:r>
+      <w:r>
+        <w:t xml:space="preserve"> ✅ COMPLETE — All 5 trained on OpenCows2020 (46 classes).</w:t>
       </w:r>
     </w:p>
     <w:p>
       <w:pPr>
+        <w:pStyle w:val="ListBullet"/>
+        <w:spacing w:after="60"/>
+      </w:pPr>
+      <w:r>
+        <w:t>Best: EfficientNetB0 (86.49%) | Worst: ResNet-18 (45.56%)</w:t>
+      </w:r>
+    </w:p>
+    <w:p>
+      <w:pPr>
         <w:pStyle w:val="ListNumber"/>
         <w:spacing w:after="60"/>
       </w:pPr>
@@ -3787,46 +3830,69 @@
         <w:rPr>
           <w:b/>
         </w:rPr>
-        <w:t>Final Multi-Task Aggregation:</w:t>
-      </w:r>
-      <w:r>
-        <w:t xml:space="preserve"> [100% COMPLETE] The Spatiotemporal Multi-Task model (EfficientNetB0-LSTM) was trained across all 4 heads simultaneously using 20-frame sequences. It achieved </w:t>
-      </w:r>
+        <w:t>Multi-Task Static Model (Nusrat):</w:t>
+      </w:r>
+      <w:r>
+        <w:t xml:space="preserve"> ✅ COMPLETE — `train_multitask.py` trained with YOLO-cropped datasets.</w:t>
+      </w:r>
+    </w:p>
+    <w:p>
+      <w:pPr>
+        <w:pStyle w:val="ListBullet"/>
+        <w:spacing w:after="60"/>
+      </w:pPr>
+      <w:r>
+        <w:t>Results: BCS MAE 0.7266 (Exact 40.78%, ±1 87.64%), Behavior F1 0.3771, Lameness Acc 95.28% (AUC 0.9921), ID Acc 94.96%</w:t>
+      </w:r>
+    </w:p>
+    <w:p>
+      <w:pPr>
+        <w:pStyle w:val="ListNumber"/>
+        <w:spacing w:after="60"/>
+      </w:pPr>
+      <w:r/>
       <w:r>
         <w:rPr>
           <w:b/>
         </w:rPr>
-        <w:t>100.00% Lameness Accuracy (AUC 1.0)</w:t>
-      </w:r>
-      <w:r>
-        <w:t xml:space="preserve">, </w:t>
+        <w:t>Spatiotemporal Multi-Task Model (Nusrat):</w:t>
+      </w:r>
+      <w:r>
+        <w:t xml:space="preserve"> ✅ COMPLETE — `train_multitask_temporal.py` trained.</w:t>
+      </w:r>
+    </w:p>
+    <w:p>
+      <w:pPr>
+        <w:pStyle w:val="ListBullet"/>
+        <w:spacing w:after="60"/>
+      </w:pPr>
+      <w:r>
+        <w:t xml:space="preserve">Results: BCS MAE 0.7827 (Exact 39.31%, ±1 84.82%), Behavior F1 0.4948, Lameness Acc </w:t>
       </w:r>
       <w:r>
         <w:rPr>
           <w:b/>
         </w:rPr>
-        <w:t>97.18% ID Accuracy</w:t>
-      </w:r>
-      <w:r>
-        <w:t xml:space="preserve">, </w:t>
-      </w:r>
+        <w:t>100.00%</w:t>
+      </w:r>
+      <w:r>
+        <w:t xml:space="preserve"> (AUC 1.0000), ID Acc 97.58%</w:t>
+      </w:r>
+    </w:p>
+    <w:p>
+      <w:pPr>
+        <w:pStyle w:val="ListNumber"/>
+        <w:spacing w:after="60"/>
+      </w:pPr>
+      <w:r/>
       <w:r>
         <w:rPr>
           <w:b/>
         </w:rPr>
-        <w:t>0.7849 BCS MAE</w:t>
-      </w:r>
-      <w:r>
-        <w:t xml:space="preserve">, and </w:t>
-      </w:r>
-      <w:r>
-        <w:rPr>
-          <w:b/>
-        </w:rPr>
-        <w:t>0.4775 Behavior Macro F1</w:t>
-      </w:r>
-      <w:r>
-        <w:t>. A rolling sequence real-time visualizer was built and successfully deployed.</w:t>
+        <w:t>Ablation Studies (Nusrat):</w:t>
+      </w:r>
+      <w:r>
+        <w:t xml:space="preserve"> ⏳ IN PROGRESS — ScienceDB Cross-Entropy ablation is completed (Test MAE `0.6940` vs. CORAL `0.5566`). Dryad No-CBAM ablation is completed (Test MAE `0.7000` vs. CBAM `0.6175`). `ablation_behavior_ce.py` is pending.</w:t>
       </w:r>
     </w:p>
     <w:p>
@@ -3915,16 +3981,7 @@
         <w:t>Joint Fine-Tuning (Unfreezing the Backbone):</w:t>
       </w:r>
       <w:r>
-        <w:t xml:space="preserve"> In the final phase, we intend to perform Fine-Tuning </w:t>
-      </w:r>
-      <w:r>
-        <w:rPr>
-          <w:i/>
-        </w:rPr>
-        <w:t>(unfreezing pretrained layers and training them with a very small learning rate to adapt them to a new, specific task)</w:t>
-      </w:r>
-      <w:r>
-        <w:t xml:space="preserve"> by unfreezing the shared backbone and allowing gradients from the LSTM to flow all the way backward into the CNN layers. This forces the backbone to learn new convolutional filters specifically designed to track motion and joint angles.</w:t>
+        <w:t xml:space="preserve"> ✅ IMPLEMENTED — The current multitask training already implements Phase 6 joint fine-tuning (backbone unfrozen, LR=1e-4) after the 4 frozen-head phases. This forces the backbone to co-adapt with all task heads.</w:t>
       </w:r>
     </w:p>
     <w:p>
@@ -3940,16 +3997,7 @@
         <w:t>Cross-Dataset Validation (CBVD-5):</w:t>
       </w:r>
       <w:r>
-        <w:t xml:space="preserve"> To prove generalizability, we will perform Cross-Dataset Validation </w:t>
-      </w:r>
-      <w:r>
-        <w:rPr>
-          <w:i/>
-        </w:rPr>
-        <w:t>(testing a model trained on one dataset on an entirely different, independent dataset to prove generalizability)</w:t>
-      </w:r>
-      <w:r>
-        <w:t xml:space="preserve"> by taking the Behavior model trained on `MmCows` and running inference on the entirely unseen `CBVD-5` dataset.</w:t>
+        <w:t xml:space="preserve"> ✅ COMPLETE — Behavior model (MmCows-trained EfficientNetB0) evaluated on CBVD-5 (2,000 images). Macro F1: 0.1245. Domain shift confirmed — generalizes to Standing (90.34%) but fails on Feeding (8.39%), Drinking (2.99%), Lying (24.31%).</w:t>
       </w:r>
     </w:p>
     <w:p>
@@ -3962,7 +4010,23 @@
         <w:rPr>
           <w:b/>
         </w:rPr>
-        <w:t>Advanced Enhancements:</w:t>
+        <w:t>Gradient Alignment (Future):</w:t>
+      </w:r>
+      <w:r>
+        <w:t xml:space="preserve"> GradNorm or PCGrad to mitigate destructive interference between static (BCS) and temporal (Lameness/Behavior) tasks in multi-task training.</w:t>
+      </w:r>
+    </w:p>
+    <w:p>
+      <w:pPr>
+        <w:pStyle w:val="ListNumber"/>
+        <w:spacing w:after="60"/>
+      </w:pPr>
+      <w:r/>
+      <w:r>
+        <w:rPr>
+          <w:b/>
+        </w:rPr>
+        <w:t>Advanced Enhancements (Future):</w:t>
       </w:r>
       <w:r/>
     </w:p>
@@ -4000,6 +4064,15 @@
       </w:pPr>
       <w:r>
         <w:t>Future exploration into integrating depth cameras or thermal imaging for highly granular lameness inflammation detection.</w:t>
+      </w:r>
+    </w:p>
+    <w:p>
+      <w:pPr>
+        <w:pStyle w:val="ListBullet"/>
+        <w:spacing w:after="60"/>
+      </w:pPr>
+      <w:r>
+        <w:t>Multi-farm dataset aggregation to address domain shift in cross-dataset generalization.</w:t>
       </w:r>
     </w:p>
     <w:p>
@@ -4495,7 +4568,7 @@
         <w:t>Spatiotemporal Multi-Task model</w:t>
       </w:r>
       <w:r>
-        <w:t>, we observed that the temporal LSTM heads achieved perfect Lameness identification (`1.00` AUC and `100%` Acc) and significantly improved Cow ID accuracy (`97.18%`). However, due to destructive interference on highly constrained shared backbones, the spatial metrics slightly degraded (BCS MAE dropped to `0.7849` and Behavior Macro F1 dropped to `0.4775`). This proves the multi-task tradeoff: massive compute and hardware savings and perfect temporal performance, at the cost of a slight drop in static spatial accuracy.</w:t>
+        <w:t>, we observed that the temporal LSTM heads achieved perfect Lameness identification (`1.0000` AUC and `100.00%` Acc) and significantly improved Cow ID accuracy (`97.58%`). However, due to destructive interference on highly constrained shared backbones, the spatial metrics slightly degraded (BCS MAE dropped to `0.7827` and Behavior Macro F1 dropped to `0.4948`). This proves the multi-task tradeoff: massive compute and hardware savings and perfect temporal performance, at the cost of a slight drop in static spatial accuracy.</w:t>
       </w:r>
     </w:p>
     <w:p>

</xml_diff>